<commit_message>
Overwrite story_revised document with updated version
</commit_message>
<xml_diff>
--- a/story_revised (1).docx
+++ b/story_revised (1).docx
@@ -289,25 +289,7 @@
           <w:szCs w:val="22"/>
           <w:lang w:bidi="dz-BT"/>
         </w:rPr>
-        <w:t xml:space="preserve">, unfamiliar signage, the air laced with fresh concrete and cut timber somewhere </w:t>
-      </w:r>
-      <w:proofErr w:type="gramStart"/>
-      <w:r>
-        <w:rPr>
-          <w:rFonts w:ascii="Arial" w:eastAsia="Times New Roman" w:hAnsi="Arial" w:cs="Arial"/>
-          <w:szCs w:val="22"/>
-          <w:lang w:bidi="dz-BT"/>
-        </w:rPr>
-        <w:t>behind</w:t>
-      </w:r>
-      <w:proofErr w:type="gramEnd"/>
-      <w:r>
-        <w:rPr>
-          <w:rFonts w:ascii="Arial" w:eastAsia="Times New Roman" w:hAnsi="Arial" w:cs="Arial"/>
-          <w:szCs w:val="22"/>
-          <w:lang w:bidi="dz-BT"/>
-        </w:rPr>
-        <w:t xml:space="preserve"> the finished buildings.</w:t>
+        <w:t>, unfamiliar signage, the air laced with fresh concrete and cut timber somewhere behind the finished buildings.</w:t>
       </w:r>
     </w:p>
     <w:p>
@@ -590,41 +572,18 @@
         <w:spacing w:before="100" w:beforeAutospacing="1" w:after="100" w:afterAutospacing="1" w:line="360" w:lineRule="auto"/>
         <w:jc w:val="both"/>
         <w:rPr>
-          <w:del w:id="0" w:author="Microsoft account" w:date="2026-04-14T08:12:00Z"/>
-          <w:rFonts w:ascii="Arial" w:eastAsia="Times New Roman" w:hAnsi="Arial" w:cs="Arial"/>
-          <w:szCs w:val="22"/>
-          <w:lang w:bidi="dz-BT"/>
-        </w:rPr>
-      </w:pPr>
-    </w:p>
-    <w:p>
-      <w:pPr>
-        <w:spacing w:before="100" w:beforeAutospacing="1" w:after="100" w:afterAutospacing="1" w:line="360" w:lineRule="auto"/>
-        <w:jc w:val="both"/>
-        <w:rPr>
-          <w:del w:id="1" w:author="Microsoft account" w:date="2026-04-14T08:12:00Z"/>
-          <w:rFonts w:ascii="Arial" w:eastAsia="Times New Roman" w:hAnsi="Arial" w:cs="Arial"/>
-          <w:szCs w:val="22"/>
-          <w:lang w:bidi="dz-BT"/>
-        </w:rPr>
-      </w:pPr>
-    </w:p>
-    <w:p>
-      <w:pPr>
-        <w:spacing w:before="100" w:beforeAutospacing="1" w:after="100" w:afterAutospacing="1" w:line="360" w:lineRule="auto"/>
-        <w:jc w:val="both"/>
-        <w:rPr>
-          <w:rFonts w:ascii="Arial" w:eastAsia="Times New Roman" w:hAnsi="Arial" w:cs="Arial"/>
-          <w:szCs w:val="22"/>
-          <w:lang w:bidi="dz-BT"/>
-        </w:rPr>
-      </w:pPr>
-      <w:r>
-        <w:rPr>
-          <w:rFonts w:ascii="Arial" w:eastAsia="Times New Roman" w:hAnsi="Arial" w:cs="Arial"/>
-          <w:szCs w:val="22"/>
-          <w:lang w:bidi="dz-BT"/>
-        </w:rPr>
+          <w:rFonts w:ascii="Arial" w:eastAsia="Times New Roman" w:hAnsi="Arial" w:cs="Arial"/>
+          <w:szCs w:val="22"/>
+          <w:lang w:bidi="dz-BT"/>
+        </w:rPr>
+      </w:pPr>
+      <w:r>
+        <w:rPr>
+          <w:rFonts w:ascii="Arial" w:eastAsia="Times New Roman" w:hAnsi="Arial" w:cs="Arial"/>
+          <w:szCs w:val="22"/>
+          <w:lang w:bidi="dz-BT"/>
+        </w:rPr>
+        <w:lastRenderedPageBreak/>
         <w:t>Then he notices the sign.</w:t>
       </w:r>
     </w:p>
@@ -1018,7 +977,7 @@
           <w:szCs w:val="22"/>
           <w:lang w:bidi="dz-BT"/>
         </w:rPr>
-        <w:t xml:space="preserve">Amount: 1.28 TER (≈ 180 BTN)  </w:t>
+        <w:t xml:space="preserve">Amount to merchant: 1.28 TER (≈ 180 BTN)  </w:t>
       </w:r>
     </w:p>
     <w:p>
@@ -1057,7 +1016,7 @@
           <w:szCs w:val="22"/>
           <w:lang w:bidi="dz-BT"/>
         </w:rPr>
-        <w:t xml:space="preserve">Backed by: 0.0128g gold  </w:t>
+        <w:t xml:space="preserve">Your auto-save (10%): +0.128 TER  </w:t>
       </w:r>
     </w:p>
     <w:p>
@@ -1089,6 +1048,15 @@
           <w:lang w:bidi="dz-BT"/>
         </w:rPr>
       </w:pPr>
+      <w:r>
+        <w:rPr>
+          <w:rFonts w:ascii="Arial" w:eastAsia="Times New Roman" w:hAnsi="Arial" w:cs="Arial"/>
+          <w:color w:val="14181F"/>
+          <w:szCs w:val="22"/>
+          <w:lang w:bidi="dz-BT"/>
+        </w:rPr>
+        <w:t xml:space="preserve">Total from your balance: 1.408 TER  </w:t>
+      </w:r>
     </w:p>
     <w:p>
       <w:pPr>
@@ -1126,49 +1094,94 @@
           <w:szCs w:val="22"/>
           <w:lang w:bidi="dz-BT"/>
         </w:rPr>
+        <w:t xml:space="preserve">Backed by: 0.01408g gold  </w:t>
+      </w:r>
+    </w:p>
+    <w:p>
+      <w:pPr>
+        <w:tabs>
+          <w:tab w:val="left" w:pos="916"/>
+          <w:tab w:val="left" w:pos="1832"/>
+          <w:tab w:val="left" w:pos="2748"/>
+          <w:tab w:val="left" w:pos="3664"/>
+          <w:tab w:val="left" w:pos="4580"/>
+          <w:tab w:val="left" w:pos="5496"/>
+          <w:tab w:val="left" w:pos="6412"/>
+          <w:tab w:val="left" w:pos="7328"/>
+          <w:tab w:val="left" w:pos="8244"/>
+          <w:tab w:val="left" w:pos="9160"/>
+          <w:tab w:val="left" w:pos="10076"/>
+          <w:tab w:val="left" w:pos="10992"/>
+          <w:tab w:val="left" w:pos="11908"/>
+          <w:tab w:val="left" w:pos="12824"/>
+          <w:tab w:val="left" w:pos="13740"/>
+          <w:tab w:val="left" w:pos="14656"/>
+        </w:tabs>
+        <w:spacing w:after="0" w:line="360" w:lineRule="auto"/>
+        <w:jc w:val="both"/>
+        <w:rPr>
+          <w:rFonts w:ascii="Arial" w:eastAsia="Times New Roman" w:hAnsi="Arial" w:cs="Arial"/>
+          <w:color w:val="14181F"/>
+          <w:szCs w:val="22"/>
+          <w:lang w:bidi="dz-BT"/>
+        </w:rPr>
+      </w:pPr>
+    </w:p>
+    <w:p>
+      <w:pPr>
+        <w:tabs>
+          <w:tab w:val="left" w:pos="916"/>
+          <w:tab w:val="left" w:pos="1832"/>
+          <w:tab w:val="left" w:pos="2748"/>
+          <w:tab w:val="left" w:pos="3664"/>
+          <w:tab w:val="left" w:pos="4580"/>
+          <w:tab w:val="left" w:pos="5496"/>
+          <w:tab w:val="left" w:pos="6412"/>
+          <w:tab w:val="left" w:pos="7328"/>
+          <w:tab w:val="left" w:pos="8244"/>
+          <w:tab w:val="left" w:pos="9160"/>
+          <w:tab w:val="left" w:pos="10076"/>
+          <w:tab w:val="left" w:pos="10992"/>
+          <w:tab w:val="left" w:pos="11908"/>
+          <w:tab w:val="left" w:pos="12824"/>
+          <w:tab w:val="left" w:pos="13740"/>
+          <w:tab w:val="left" w:pos="14656"/>
+        </w:tabs>
+        <w:spacing w:after="0" w:line="360" w:lineRule="auto"/>
+        <w:jc w:val="both"/>
+        <w:rPr>
+          <w:rFonts w:ascii="Arial" w:eastAsia="Times New Roman" w:hAnsi="Arial" w:cs="Arial"/>
+          <w:color w:val="14181F"/>
+          <w:szCs w:val="22"/>
+          <w:lang w:bidi="dz-BT"/>
+        </w:rPr>
+      </w:pPr>
+      <w:r>
+        <w:rPr>
+          <w:rFonts w:ascii="Arial" w:eastAsia="Times New Roman" w:hAnsi="Arial" w:cs="Arial"/>
+          <w:color w:val="14181F"/>
+          <w:szCs w:val="22"/>
+          <w:lang w:bidi="dz-BT"/>
+        </w:rPr>
         <w:t>[Confirm Payment]</w:t>
       </w:r>
     </w:p>
     <w:p>
       <w:pPr>
-        <w:spacing w:before="100" w:beforeAutospacing="1" w:after="100" w:afterAutospacing="1" w:line="360" w:lineRule="auto"/>
-        <w:jc w:val="both"/>
-        <w:rPr>
-          <w:rFonts w:ascii="Arial" w:eastAsia="Times New Roman" w:hAnsi="Arial" w:cs="Arial"/>
-          <w:szCs w:val="22"/>
-          <w:lang w:bidi="dz-BT"/>
-        </w:rPr>
-      </w:pPr>
-      <w:r>
-        <w:rPr>
-          <w:rFonts w:ascii="Arial" w:eastAsia="Times New Roman" w:hAnsi="Arial" w:cs="Arial"/>
-          <w:szCs w:val="22"/>
-          <w:lang w:bidi="dz-BT"/>
-        </w:rPr>
-        <w:t>He enters his PIN. A soft haptic pulse. One beat.</w:t>
-      </w:r>
-    </w:p>
-    <w:p>
-      <w:pPr>
-        <w:spacing w:before="100" w:beforeAutospacing="1" w:after="100" w:afterAutospacing="1" w:line="360" w:lineRule="auto"/>
-        <w:jc w:val="both"/>
-        <w:rPr>
-          <w:rFonts w:ascii="Arial" w:eastAsia="Times New Roman" w:hAnsi="Arial" w:cs="Arial"/>
-          <w:szCs w:val="22"/>
-          <w:lang w:bidi="dz-BT"/>
-        </w:rPr>
-      </w:pPr>
-    </w:p>
-    <w:p>
-      <w:pPr>
-        <w:spacing w:before="100" w:beforeAutospacing="1" w:after="100" w:afterAutospacing="1" w:line="360" w:lineRule="auto"/>
-        <w:jc w:val="both"/>
-        <w:rPr>
-          <w:rFonts w:ascii="Arial" w:eastAsia="Times New Roman" w:hAnsi="Arial" w:cs="Arial"/>
-          <w:szCs w:val="22"/>
-          <w:lang w:bidi="dz-BT"/>
-        </w:rPr>
-      </w:pPr>
+        <w:rPr>
+          <w:rFonts w:ascii="Arial" w:eastAsia="Times New Roman" w:hAnsi="Arial" w:cs="Arial"/>
+          <w:szCs w:val="22"/>
+          <w:lang w:bidi="dz-BT"/>
+        </w:rPr>
+      </w:pPr>
+      <w:r>
+        <w:rPr>
+          <w:rFonts w:ascii="Arial" w:eastAsia="Times New Roman" w:hAnsi="Arial" w:cs="Arial"/>
+          <w:szCs w:val="22"/>
+          <w:lang w:bidi="dz-BT"/>
+        </w:rPr>
+        <w:t>He enters his PIN.</w:t>
+      </w:r>
     </w:p>
     <w:p>
       <w:pPr>
@@ -1400,7 +1413,7 @@
           <w:szCs w:val="22"/>
           <w:lang w:bidi="dz-BT"/>
         </w:rPr>
-        <w:t>Deki's</w:t>
+        <w:t>Deki’s</w:t>
       </w:r>
       <w:proofErr w:type="spellEnd"/>
       <w:r>
@@ -1432,7 +1445,7 @@
           <w:szCs w:val="22"/>
           <w:lang w:bidi="dz-BT"/>
         </w:rPr>
-        <w:t xml:space="preserve">A unique Transaction ID was embedded in the memo field, making the payment permanently traceable on the Solana </w:t>
+        <w:t xml:space="preserve">Separately, 0.128 TER was swept from Karma’s own balance into his Savings Pot — his 10% auto-save rate applied silently to the payment, the same way it applies to </w:t>
       </w:r>
       <w:proofErr w:type="spellStart"/>
       <w:r>
@@ -1441,7 +1454,7 @@
           <w:szCs w:val="22"/>
           <w:lang w:bidi="dz-BT"/>
         </w:rPr>
-        <w:t>blockchain</w:t>
+        <w:t>Deki</w:t>
       </w:r>
       <w:proofErr w:type="spellEnd"/>
       <w:r>
@@ -1450,7 +1463,7 @@
           <w:szCs w:val="22"/>
           <w:lang w:bidi="dz-BT"/>
         </w:rPr>
-        <w:t xml:space="preserve"> ledger</w:t>
+        <w:t xml:space="preserve"> on the receiving side</w:t>
       </w:r>
     </w:p>
     <w:p>
@@ -1473,7 +1486,25 @@
           <w:szCs w:val="22"/>
           <w:lang w:bidi="dz-BT"/>
         </w:rPr>
-        <w:t xml:space="preserve">Both devices received confirmation </w:t>
+        <w:t xml:space="preserve">A unique Transaction ID was embedded in the memo field, making the payment permanently traceable on the Solana </w:t>
+      </w:r>
+      <w:proofErr w:type="spellStart"/>
+      <w:r>
+        <w:rPr>
+          <w:rFonts w:ascii="Arial" w:eastAsia="Times New Roman" w:hAnsi="Arial" w:cs="Arial"/>
+          <w:szCs w:val="22"/>
+          <w:lang w:bidi="dz-BT"/>
+        </w:rPr>
+        <w:t>blockchain</w:t>
+      </w:r>
+      <w:proofErr w:type="spellEnd"/>
+      <w:r>
+        <w:rPr>
+          <w:rFonts w:ascii="Arial" w:eastAsia="Times New Roman" w:hAnsi="Arial" w:cs="Arial"/>
+          <w:szCs w:val="22"/>
+          <w:lang w:bidi="dz-BT"/>
+        </w:rPr>
+        <w:t xml:space="preserve"> ledger</w:t>
       </w:r>
     </w:p>
     <w:p>
@@ -1496,6 +1527,29 @@
           <w:szCs w:val="22"/>
           <w:lang w:bidi="dz-BT"/>
         </w:rPr>
+        <w:t xml:space="preserve">Both devices received confirmation </w:t>
+      </w:r>
+    </w:p>
+    <w:p>
+      <w:pPr>
+        <w:numPr>
+          <w:ilvl w:val="0"/>
+          <w:numId w:val="2"/>
+        </w:numPr>
+        <w:spacing w:before="100" w:beforeAutospacing="1" w:after="100" w:afterAutospacing="1" w:line="360" w:lineRule="auto"/>
+        <w:jc w:val="both"/>
+        <w:rPr>
+          <w:rFonts w:ascii="Arial" w:eastAsia="Times New Roman" w:hAnsi="Arial" w:cs="Arial"/>
+          <w:szCs w:val="22"/>
+          <w:lang w:bidi="dz-BT"/>
+        </w:rPr>
+      </w:pPr>
+      <w:r>
+        <w:rPr>
+          <w:rFonts w:ascii="Arial" w:eastAsia="Times New Roman" w:hAnsi="Arial" w:cs="Arial"/>
+          <w:szCs w:val="22"/>
+          <w:lang w:bidi="dz-BT"/>
+        </w:rPr>
         <w:t>Karma's total balance remained hidden throughout; only the payment amount was ever visible, though tapping ‘Reveal Balance’ would display his full holdings at any time</w:t>
       </w:r>
     </w:p>
@@ -1523,7 +1577,6 @@
         <w:spacing w:before="100" w:beforeAutospacing="1" w:after="100" w:afterAutospacing="1" w:line="360" w:lineRule="auto"/>
         <w:jc w:val="both"/>
         <w:rPr>
-          <w:del w:id="2" w:author="Microsoft account" w:date="2026-04-14T08:12:00Z"/>
           <w:rFonts w:ascii="Arial" w:eastAsia="Times New Roman" w:hAnsi="Arial" w:cs="Arial"/>
           <w:szCs w:val="22"/>
           <w:lang w:bidi="dz-BT"/>
@@ -1537,29 +1590,6 @@
         </w:rPr>
         <w:t>What mattered most was something he had not expected to feel: that by using TER, he was contributing directly to the GMC economy. The payment worked, the value felt stable, and he had done his small part in building something new.</w:t>
       </w:r>
-    </w:p>
-    <w:p>
-      <w:pPr>
-        <w:spacing w:before="100" w:beforeAutospacing="1" w:after="100" w:afterAutospacing="1" w:line="360" w:lineRule="auto"/>
-        <w:jc w:val="both"/>
-        <w:rPr>
-          <w:del w:id="3" w:author="Microsoft account" w:date="2026-04-14T08:12:00Z"/>
-          <w:rFonts w:ascii="Arial" w:eastAsia="Times New Roman" w:hAnsi="Arial" w:cs="Arial"/>
-          <w:szCs w:val="22"/>
-          <w:lang w:bidi="dz-BT"/>
-        </w:rPr>
-      </w:pPr>
-    </w:p>
-    <w:p>
-      <w:pPr>
-        <w:spacing w:before="100" w:beforeAutospacing="1" w:after="100" w:afterAutospacing="1" w:line="360" w:lineRule="auto"/>
-        <w:jc w:val="both"/>
-        <w:rPr>
-          <w:rFonts w:ascii="Arial" w:eastAsia="Times New Roman" w:hAnsi="Arial" w:cs="Arial"/>
-          <w:szCs w:val="22"/>
-          <w:lang w:bidi="dz-BT"/>
-        </w:rPr>
-      </w:pPr>
     </w:p>
     <w:p>
       <w:pPr>
@@ -1574,7 +1604,12 @@
           <w:lang w:bidi="dz-BT"/>
         </w:rPr>
       </w:pPr>
-      <w:r>
+    </w:p>
+    <w:p>
+      <w:pPr>
+        <w:spacing w:before="100" w:beforeAutospacing="1" w:after="100" w:afterAutospacing="1" w:line="360" w:lineRule="auto"/>
+        <w:jc w:val="both"/>
+        <w:outlineLvl w:val="1"/>
         <w:rPr>
           <w:rFonts w:ascii="Arial" w:eastAsia="Times New Roman" w:hAnsi="Arial" w:cs="Arial"/>
           <w:b/>
@@ -1582,6 +1617,57 @@
           <w:szCs w:val="22"/>
           <w:lang w:bidi="dz-BT"/>
         </w:rPr>
+      </w:pPr>
+    </w:p>
+    <w:p>
+      <w:pPr>
+        <w:spacing w:before="100" w:beforeAutospacing="1" w:after="100" w:afterAutospacing="1" w:line="360" w:lineRule="auto"/>
+        <w:jc w:val="both"/>
+        <w:outlineLvl w:val="1"/>
+        <w:rPr>
+          <w:rFonts w:ascii="Arial" w:eastAsia="Times New Roman" w:hAnsi="Arial" w:cs="Arial"/>
+          <w:b/>
+          <w:bCs/>
+          <w:szCs w:val="22"/>
+          <w:lang w:bidi="dz-BT"/>
+        </w:rPr>
+      </w:pPr>
+    </w:p>
+    <w:p>
+      <w:pPr>
+        <w:spacing w:before="100" w:beforeAutospacing="1" w:after="100" w:afterAutospacing="1" w:line="360" w:lineRule="auto"/>
+        <w:jc w:val="both"/>
+        <w:outlineLvl w:val="1"/>
+        <w:rPr>
+          <w:rFonts w:ascii="Arial" w:eastAsia="Times New Roman" w:hAnsi="Arial" w:cs="Arial"/>
+          <w:b/>
+          <w:bCs/>
+          <w:szCs w:val="22"/>
+          <w:lang w:bidi="dz-BT"/>
+        </w:rPr>
+      </w:pPr>
+    </w:p>
+    <w:p>
+      <w:pPr>
+        <w:spacing w:before="100" w:beforeAutospacing="1" w:after="100" w:afterAutospacing="1" w:line="360" w:lineRule="auto"/>
+        <w:jc w:val="both"/>
+        <w:outlineLvl w:val="1"/>
+        <w:rPr>
+          <w:rFonts w:ascii="Arial" w:eastAsia="Times New Roman" w:hAnsi="Arial" w:cs="Arial"/>
+          <w:b/>
+          <w:bCs/>
+          <w:szCs w:val="22"/>
+          <w:lang w:bidi="dz-BT"/>
+        </w:rPr>
+      </w:pPr>
+      <w:r>
+        <w:rPr>
+          <w:rFonts w:ascii="Arial" w:eastAsia="Times New Roman" w:hAnsi="Arial" w:cs="Arial"/>
+          <w:b/>
+          <w:bCs/>
+          <w:szCs w:val="22"/>
+          <w:lang w:bidi="dz-BT"/>
+        </w:rPr>
         <w:t>After</w:t>
       </w:r>
     </w:p>
@@ -1656,7 +1742,41 @@
           <w:szCs w:val="22"/>
           <w:lang w:bidi="dz-BT"/>
         </w:rPr>
-        <w:t>-recorded transfer of value backed by 0.0128 grams of physical gold, completed in under a second, in a restaurant in a city that didn't exist five years ago. And he felt something he hadn't expected: quiet satisfaction. He had invested in TER once, hoping to support the emerging digital ecosystem. Today, he had actually used it. The circle had closed.</w:t>
+        <w:t>-recorded transfer of value backed by gold, completed in under a second, in a restaurant in a city that didn’t exist five years ago. And quietly, without him having to think about it, 0.128 TER had moved into his Savings Pot at the same moment</w:t>
+      </w:r>
+      <w:r>
+        <w:rPr>
+          <w:rFonts w:ascii="Arial" w:eastAsia="Times New Roman" w:hAnsi="Arial" w:cs="Arial"/>
+          <w:szCs w:val="22"/>
+          <w:lang w:bidi="dz-BT"/>
+        </w:rPr>
+        <w:t xml:space="preserve">, </w:t>
+      </w:r>
+      <w:r>
+        <w:rPr>
+          <w:rFonts w:ascii="Arial" w:eastAsia="Times New Roman" w:hAnsi="Arial" w:cs="Arial"/>
+          <w:szCs w:val="22"/>
+          <w:lang w:bidi="dz-BT"/>
+        </w:rPr>
+        <w:t xml:space="preserve">the same mechanic that worked for </w:t>
+      </w:r>
+      <w:proofErr w:type="spellStart"/>
+      <w:r>
+        <w:rPr>
+          <w:rFonts w:ascii="Arial" w:eastAsia="Times New Roman" w:hAnsi="Arial" w:cs="Arial"/>
+          <w:szCs w:val="22"/>
+          <w:lang w:bidi="dz-BT"/>
+        </w:rPr>
+        <w:t>Deki</w:t>
+      </w:r>
+      <w:proofErr w:type="spellEnd"/>
+      <w:r>
+        <w:rPr>
+          <w:rFonts w:ascii="Arial" w:eastAsia="Times New Roman" w:hAnsi="Arial" w:cs="Arial"/>
+          <w:szCs w:val="22"/>
+          <w:lang w:bidi="dz-BT"/>
+        </w:rPr>
+        <w:t xml:space="preserve"> on the other side of the counter. Both of them saving, from the same single payment. And he felt something he hadn’t expected: quiet satisfaction. He had invested in TER once, hoping to support the emerging digital ecosystem. Today, he had actually used it. The circle had closed.</w:t>
       </w:r>
     </w:p>
     <w:p>
@@ -1757,13 +1877,6 @@
       <w:pPr>
         <w:spacing w:before="100" w:beforeAutospacing="1" w:after="100" w:afterAutospacing="1" w:line="360" w:lineRule="auto"/>
         <w:jc w:val="both"/>
-        <w:rPr>
-          <w:rFonts w:ascii="Arial" w:eastAsia="Times New Roman" w:hAnsi="Arial" w:cs="Arial"/>
-          <w:szCs w:val="22"/>
-          <w:lang w:bidi="dz-BT"/>
-        </w:rPr>
-      </w:pPr>
-      <w:r>
         <w:rPr>
           <w:rFonts w:ascii="Arial" w:eastAsia="Times New Roman" w:hAnsi="Arial" w:cs="Arial"/>
           <w:i/>
@@ -1771,8 +1884,106 @@
           <w:szCs w:val="22"/>
           <w:lang w:bidi="dz-BT"/>
         </w:rPr>
+      </w:pPr>
+      <w:r>
+        <w:rPr>
+          <w:rFonts w:ascii="Arial" w:eastAsia="Times New Roman" w:hAnsi="Arial" w:cs="Arial"/>
+          <w:i/>
+          <w:iCs/>
+          <w:szCs w:val="22"/>
+          <w:lang w:bidi="dz-BT"/>
+        </w:rPr>
         <w:t>He typed three words: "Try TER. Today."</w:t>
       </w:r>
+    </w:p>
+    <w:p>
+      <w:pPr>
+        <w:spacing w:before="100" w:beforeAutospacing="1" w:after="100" w:afterAutospacing="1" w:line="360" w:lineRule="auto"/>
+        <w:jc w:val="both"/>
+        <w:rPr>
+          <w:rFonts w:ascii="Arial" w:eastAsia="Times New Roman" w:hAnsi="Arial" w:cs="Arial"/>
+          <w:i/>
+          <w:iCs/>
+          <w:szCs w:val="22"/>
+          <w:lang w:bidi="dz-BT"/>
+        </w:rPr>
+      </w:pPr>
+    </w:p>
+    <w:p>
+      <w:pPr>
+        <w:spacing w:before="100" w:beforeAutospacing="1" w:after="100" w:afterAutospacing="1" w:line="360" w:lineRule="auto"/>
+        <w:jc w:val="both"/>
+        <w:rPr>
+          <w:rFonts w:ascii="Arial" w:eastAsia="Times New Roman" w:hAnsi="Arial" w:cs="Arial"/>
+          <w:i/>
+          <w:iCs/>
+          <w:szCs w:val="22"/>
+          <w:lang w:bidi="dz-BT"/>
+        </w:rPr>
+      </w:pPr>
+    </w:p>
+    <w:p>
+      <w:pPr>
+        <w:spacing w:before="100" w:beforeAutospacing="1" w:after="100" w:afterAutospacing="1" w:line="360" w:lineRule="auto"/>
+        <w:jc w:val="both"/>
+        <w:rPr>
+          <w:rFonts w:ascii="Arial" w:eastAsia="Times New Roman" w:hAnsi="Arial" w:cs="Arial"/>
+          <w:i/>
+          <w:iCs/>
+          <w:szCs w:val="22"/>
+          <w:lang w:bidi="dz-BT"/>
+        </w:rPr>
+      </w:pPr>
+    </w:p>
+    <w:p>
+      <w:pPr>
+        <w:spacing w:before="100" w:beforeAutospacing="1" w:after="100" w:afterAutospacing="1" w:line="360" w:lineRule="auto"/>
+        <w:jc w:val="both"/>
+        <w:rPr>
+          <w:rFonts w:ascii="Arial" w:eastAsia="Times New Roman" w:hAnsi="Arial" w:cs="Arial"/>
+          <w:i/>
+          <w:iCs/>
+          <w:szCs w:val="22"/>
+          <w:lang w:bidi="dz-BT"/>
+        </w:rPr>
+      </w:pPr>
+    </w:p>
+    <w:p>
+      <w:pPr>
+        <w:spacing w:before="100" w:beforeAutospacing="1" w:after="100" w:afterAutospacing="1" w:line="360" w:lineRule="auto"/>
+        <w:jc w:val="both"/>
+        <w:rPr>
+          <w:rFonts w:ascii="Arial" w:eastAsia="Times New Roman" w:hAnsi="Arial" w:cs="Arial"/>
+          <w:i/>
+          <w:iCs/>
+          <w:szCs w:val="22"/>
+          <w:lang w:bidi="dz-BT"/>
+        </w:rPr>
+      </w:pPr>
+    </w:p>
+    <w:p>
+      <w:pPr>
+        <w:spacing w:before="100" w:beforeAutospacing="1" w:after="100" w:afterAutospacing="1" w:line="360" w:lineRule="auto"/>
+        <w:jc w:val="both"/>
+        <w:rPr>
+          <w:rFonts w:ascii="Arial" w:eastAsia="Times New Roman" w:hAnsi="Arial" w:cs="Arial"/>
+          <w:i/>
+          <w:iCs/>
+          <w:szCs w:val="22"/>
+          <w:lang w:bidi="dz-BT"/>
+        </w:rPr>
+      </w:pPr>
+    </w:p>
+    <w:p>
+      <w:pPr>
+        <w:spacing w:before="100" w:beforeAutospacing="1" w:after="100" w:afterAutospacing="1" w:line="360" w:lineRule="auto"/>
+        <w:jc w:val="both"/>
+        <w:rPr>
+          <w:rFonts w:ascii="Arial" w:eastAsia="Times New Roman" w:hAnsi="Arial" w:cs="Arial"/>
+          <w:szCs w:val="22"/>
+          <w:lang w:bidi="dz-BT"/>
+        </w:rPr>
+      </w:pPr>
     </w:p>
     <w:p>
       <w:pPr>
@@ -1802,295 +2013,76 @@
       <w:pPr>
         <w:spacing w:before="100" w:beforeAutospacing="1" w:after="100" w:afterAutospacing="1" w:line="360" w:lineRule="auto"/>
         <w:jc w:val="both"/>
-        <w:rPr>
-          <w:rFonts w:ascii="Arial" w:eastAsia="Times New Roman" w:hAnsi="Arial" w:cs="Arial"/>
-          <w:szCs w:val="22"/>
-          <w:lang w:bidi="dz-BT"/>
-        </w:rPr>
-      </w:pPr>
-      <w:r>
-        <w:rPr>
-          <w:rFonts w:ascii="Arial" w:eastAsia="Times New Roman" w:hAnsi="Arial" w:cs="Arial"/>
-          <w:szCs w:val="22"/>
-          <w:lang w:bidi="dz-BT"/>
-        </w:rPr>
-        <w:t>This one small moment explains how TER-Pay really works:</w:t>
-      </w:r>
-    </w:p>
-    <w:p>
-      <w:pPr>
-        <w:pStyle w:val="ListParagraph"/>
-        <w:numPr>
-          <w:ilvl w:val="0"/>
-          <w:numId w:val="3"/>
-        </w:numPr>
-        <w:spacing w:before="100" w:beforeAutospacing="1" w:after="100" w:afterAutospacing="1" w:line="360" w:lineRule="auto"/>
-        <w:jc w:val="both"/>
-        <w:rPr>
-          <w:rFonts w:ascii="Arial" w:eastAsia="Times New Roman" w:hAnsi="Arial" w:cs="Arial"/>
-          <w:b/>
-          <w:bCs/>
-          <w:szCs w:val="22"/>
-          <w:lang w:bidi="dz-BT"/>
-        </w:rPr>
-      </w:pPr>
-      <w:r>
-        <w:rPr>
-          <w:rFonts w:ascii="Arial" w:eastAsia="Times New Roman" w:hAnsi="Arial" w:cs="Arial"/>
-          <w:b/>
-          <w:bCs/>
-          <w:szCs w:val="22"/>
-          <w:lang w:bidi="dz-BT"/>
-        </w:rPr>
-        <w:t>Stability builds trust</w:t>
-      </w:r>
-    </w:p>
-    <w:p>
-      <w:pPr>
-        <w:pStyle w:val="ListParagraph"/>
-        <w:spacing w:before="100" w:beforeAutospacing="1" w:after="100" w:afterAutospacing="1" w:line="360" w:lineRule="auto"/>
-        <w:jc w:val="both"/>
-        <w:rPr>
-          <w:rFonts w:ascii="Arial" w:eastAsia="Times New Roman" w:hAnsi="Arial" w:cs="Arial"/>
-          <w:b/>
-          <w:bCs/>
-          <w:szCs w:val="22"/>
-          <w:lang w:bidi="dz-BT"/>
-        </w:rPr>
-      </w:pPr>
-      <w:r>
-        <w:rPr>
-          <w:rFonts w:ascii="Arial" w:eastAsia="Times New Roman" w:hAnsi="Arial" w:cs="Arial"/>
-          <w:szCs w:val="22"/>
-          <w:lang w:bidi="dz-BT"/>
-        </w:rPr>
-        <w:br/>
-        <w:t xml:space="preserve">Seeing “Backed by: 0.0128g gold” makes the payment feel real. It’s not just digital anymore, it feels stable and familiar, </w:t>
-      </w:r>
-      <w:proofErr w:type="gramStart"/>
-      <w:r>
-        <w:rPr>
-          <w:rFonts w:ascii="Arial" w:eastAsia="Times New Roman" w:hAnsi="Arial" w:cs="Arial"/>
-          <w:szCs w:val="22"/>
-          <w:lang w:bidi="dz-BT"/>
-        </w:rPr>
-        <w:t>like</w:t>
-      </w:r>
-      <w:proofErr w:type="gramEnd"/>
-      <w:r>
-        <w:rPr>
-          <w:rFonts w:ascii="Arial" w:eastAsia="Times New Roman" w:hAnsi="Arial" w:cs="Arial"/>
-          <w:szCs w:val="22"/>
-          <w:lang w:bidi="dz-BT"/>
-        </w:rPr>
-        <w:t xml:space="preserve"> something people already trust.</w:t>
-      </w:r>
-    </w:p>
-    <w:p>
-      <w:pPr>
-        <w:pStyle w:val="ListParagraph"/>
-        <w:numPr>
-          <w:ilvl w:val="0"/>
-          <w:numId w:val="3"/>
-        </w:numPr>
-        <w:spacing w:before="100" w:beforeAutospacing="1" w:after="100" w:afterAutospacing="1" w:line="360" w:lineRule="auto"/>
-        <w:jc w:val="both"/>
-        <w:rPr>
-          <w:rFonts w:ascii="Arial" w:eastAsia="Times New Roman" w:hAnsi="Arial" w:cs="Arial"/>
-          <w:b/>
-          <w:bCs/>
-          <w:szCs w:val="22"/>
-          <w:lang w:bidi="dz-BT"/>
-        </w:rPr>
-      </w:pPr>
-      <w:r>
-        <w:rPr>
-          <w:rFonts w:ascii="Arial" w:eastAsia="Times New Roman" w:hAnsi="Arial" w:cs="Arial"/>
-          <w:b/>
-          <w:bCs/>
-          <w:szCs w:val="22"/>
-          <w:lang w:bidi="dz-BT"/>
-        </w:rPr>
-        <w:t>Privacy matters</w:t>
-      </w:r>
-    </w:p>
-    <w:p>
-      <w:pPr>
-        <w:pStyle w:val="ListParagraph"/>
-        <w:spacing w:before="100" w:beforeAutospacing="1" w:after="100" w:afterAutospacing="1" w:line="360" w:lineRule="auto"/>
-        <w:jc w:val="both"/>
-        <w:rPr>
-          <w:rFonts w:ascii="Arial" w:eastAsia="Times New Roman" w:hAnsi="Arial" w:cs="Arial"/>
-          <w:szCs w:val="22"/>
-          <w:lang w:bidi="dz-BT"/>
-        </w:rPr>
-      </w:pPr>
-      <w:r>
-        <w:rPr>
-          <w:rFonts w:ascii="Arial" w:eastAsia="Times New Roman" w:hAnsi="Arial" w:cs="Arial"/>
-          <w:szCs w:val="22"/>
-          <w:lang w:bidi="dz-BT"/>
-        </w:rPr>
-        <w:br/>
-        <w:t>Karma only sees what he is paying, not his full balance. This makes him feel comfortable and safe, especially in a small community where privacy is important.</w:t>
-      </w:r>
-    </w:p>
-    <w:p>
-      <w:pPr>
-        <w:pStyle w:val="ListParagraph"/>
-        <w:numPr>
-          <w:ilvl w:val="0"/>
-          <w:numId w:val="3"/>
-        </w:numPr>
-        <w:spacing w:before="100" w:beforeAutospacing="1" w:after="100" w:afterAutospacing="1" w:line="360" w:lineRule="auto"/>
-        <w:jc w:val="both"/>
-        <w:rPr>
-          <w:rFonts w:ascii="Arial" w:eastAsia="Times New Roman" w:hAnsi="Arial" w:cs="Arial"/>
-          <w:b/>
-          <w:bCs/>
-          <w:szCs w:val="22"/>
-          <w:lang w:bidi="dz-BT"/>
-        </w:rPr>
-      </w:pPr>
-      <w:r>
-        <w:rPr>
-          <w:rFonts w:ascii="Arial" w:eastAsia="Times New Roman" w:hAnsi="Arial" w:cs="Arial"/>
-          <w:b/>
-          <w:bCs/>
-          <w:szCs w:val="22"/>
-          <w:lang w:bidi="dz-BT"/>
-        </w:rPr>
-        <w:t>People trust what works</w:t>
-      </w:r>
-    </w:p>
-    <w:p>
-      <w:pPr>
-        <w:pStyle w:val="ListParagraph"/>
-        <w:spacing w:before="100" w:beforeAutospacing="1" w:after="100" w:afterAutospacing="1" w:line="360" w:lineRule="auto"/>
-        <w:jc w:val="both"/>
-        <w:rPr>
-          <w:rFonts w:ascii="Arial" w:eastAsia="Times New Roman" w:hAnsi="Arial" w:cs="Arial"/>
-          <w:szCs w:val="22"/>
-          <w:lang w:bidi="dz-BT"/>
-        </w:rPr>
-      </w:pPr>
-      <w:r>
-        <w:rPr>
-          <w:rFonts w:ascii="Arial" w:eastAsia="Times New Roman" w:hAnsi="Arial" w:cs="Arial"/>
-          <w:szCs w:val="22"/>
-          <w:lang w:bidi="dz-BT"/>
-        </w:rPr>
-        <w:br/>
-        <w:t>No one had to explain TER to Karma. He trusted it because it worked when he needed it. That experience mattered more than any explanation.</w:t>
-      </w:r>
-    </w:p>
-    <w:p>
-      <w:pPr>
-        <w:pStyle w:val="ListParagraph"/>
-        <w:spacing w:before="100" w:beforeAutospacing="1" w:after="100" w:afterAutospacing="1" w:line="360" w:lineRule="auto"/>
-        <w:jc w:val="both"/>
-        <w:rPr>
-          <w:rFonts w:ascii="Arial" w:eastAsia="Times New Roman" w:hAnsi="Arial" w:cs="Arial"/>
-          <w:szCs w:val="22"/>
-          <w:lang w:bidi="dz-BT"/>
-        </w:rPr>
-      </w:pPr>
-    </w:p>
-    <w:p>
-      <w:pPr>
-        <w:pStyle w:val="ListParagraph"/>
-        <w:numPr>
-          <w:ilvl w:val="0"/>
-          <w:numId w:val="3"/>
-        </w:numPr>
-        <w:spacing w:before="100" w:beforeAutospacing="1" w:after="100" w:afterAutospacing="1" w:line="360" w:lineRule="auto"/>
-        <w:jc w:val="both"/>
-        <w:rPr>
-          <w:rFonts w:ascii="Arial" w:eastAsia="Times New Roman" w:hAnsi="Arial" w:cs="Arial"/>
-          <w:b/>
-          <w:bCs/>
-          <w:szCs w:val="22"/>
-          <w:lang w:bidi="dz-BT"/>
-        </w:rPr>
-      </w:pPr>
-      <w:r>
-        <w:rPr>
-          <w:rFonts w:ascii="Arial" w:eastAsia="Times New Roman" w:hAnsi="Arial" w:cs="Arial"/>
-          <w:b/>
-          <w:bCs/>
-          <w:szCs w:val="22"/>
-          <w:lang w:bidi="dz-BT"/>
-        </w:rPr>
-        <w:t>Speed speaks for itself</w:t>
-      </w:r>
-    </w:p>
-    <w:p>
-      <w:pPr>
-        <w:pStyle w:val="ListParagraph"/>
-        <w:spacing w:before="100" w:beforeAutospacing="1" w:after="100" w:afterAutospacing="1" w:line="360" w:lineRule="auto"/>
-        <w:jc w:val="both"/>
-        <w:rPr>
-          <w:rFonts w:ascii="Arial" w:eastAsia="Times New Roman" w:hAnsi="Arial" w:cs="Arial"/>
-          <w:szCs w:val="22"/>
-          <w:lang w:bidi="dz-BT"/>
-        </w:rPr>
-      </w:pPr>
-      <w:r>
-        <w:rPr>
-          <w:rFonts w:ascii="Arial" w:eastAsia="Times New Roman" w:hAnsi="Arial" w:cs="Arial"/>
-          <w:szCs w:val="22"/>
-          <w:lang w:bidi="dz-BT"/>
-        </w:rPr>
-        <w:br/>
-        <w:t>The payment was done instantly. Even the people around him could see how fast it was. That alone builds confidence.</w:t>
-      </w:r>
-    </w:p>
-    <w:p>
-      <w:pPr>
-        <w:pStyle w:val="ListParagraph"/>
-        <w:numPr>
-          <w:ilvl w:val="0"/>
-          <w:numId w:val="3"/>
-        </w:numPr>
-        <w:spacing w:before="100" w:beforeAutospacing="1" w:after="100" w:afterAutospacing="1" w:line="360" w:lineRule="auto"/>
-        <w:jc w:val="both"/>
-        <w:rPr>
-          <w:rFonts w:ascii="Arial" w:eastAsia="Times New Roman" w:hAnsi="Arial" w:cs="Arial"/>
-          <w:b/>
-          <w:bCs/>
-          <w:szCs w:val="22"/>
-          <w:lang w:bidi="dz-BT"/>
-        </w:rPr>
-      </w:pPr>
-      <w:r>
-        <w:rPr>
-          <w:rFonts w:ascii="Arial" w:eastAsia="Times New Roman" w:hAnsi="Arial" w:cs="Arial"/>
-          <w:b/>
-          <w:bCs/>
-          <w:szCs w:val="22"/>
-          <w:lang w:bidi="dz-BT"/>
-        </w:rPr>
-        <w:t>Merchants need real benefits</w:t>
-      </w:r>
-    </w:p>
-    <w:p>
-      <w:pPr>
-        <w:pStyle w:val="ListParagraph"/>
-        <w:spacing w:before="100" w:beforeAutospacing="1" w:after="100" w:afterAutospacing="1" w:line="360" w:lineRule="auto"/>
-        <w:jc w:val="both"/>
-        <w:rPr>
-          <w:rFonts w:ascii="Arial" w:eastAsia="Times New Roman" w:hAnsi="Arial" w:cs="Arial"/>
-          <w:szCs w:val="22"/>
-          <w:lang w:bidi="dz-BT"/>
-        </w:rPr>
-      </w:pPr>
-      <w:r>
-        <w:rPr>
-          <w:rFonts w:ascii="Arial" w:eastAsia="Times New Roman" w:hAnsi="Arial" w:cs="Arial"/>
-          <w:szCs w:val="22"/>
-          <w:lang w:bidi="dz-BT"/>
-        </w:rPr>
-        <w:br/>
+        <w:outlineLvl w:val="1"/>
+        <w:rPr>
+          <w:rFonts w:ascii="Arial" w:eastAsia="Times New Roman" w:hAnsi="Arial" w:cs="Arial"/>
+          <w:szCs w:val="22"/>
+          <w:lang w:bidi="dz-BT"/>
+        </w:rPr>
+      </w:pPr>
+      <w:r>
+        <w:rPr>
+          <w:rFonts w:ascii="Arial" w:eastAsia="Times New Roman" w:hAnsi="Arial" w:cs="Arial"/>
+          <w:szCs w:val="22"/>
+          <w:lang w:bidi="dz-BT"/>
+        </w:rPr>
+        <w:t>T</w:t>
+      </w:r>
+      <w:r>
+        <w:rPr>
+          <w:rFonts w:ascii="Arial" w:eastAsia="Times New Roman" w:hAnsi="Arial" w:cs="Arial"/>
+          <w:szCs w:val="22"/>
+          <w:lang w:bidi="dz-BT"/>
+        </w:rPr>
+        <w:t>his small moment shows how TER-Pay works in real life</w:t>
+      </w:r>
+      <w:r>
+        <w:rPr>
+          <w:rFonts w:ascii="Arial" w:eastAsia="Times New Roman" w:hAnsi="Arial" w:cs="Arial"/>
+          <w:szCs w:val="22"/>
+          <w:lang w:bidi="dz-BT"/>
+        </w:rPr>
+        <w:t>.</w:t>
+      </w:r>
+    </w:p>
+    <w:p>
+      <w:pPr>
+        <w:spacing w:before="100" w:beforeAutospacing="1" w:after="100" w:afterAutospacing="1" w:line="360" w:lineRule="auto"/>
+        <w:jc w:val="both"/>
+        <w:outlineLvl w:val="1"/>
+        <w:rPr>
+          <w:rFonts w:ascii="Arial" w:eastAsia="Times New Roman" w:hAnsi="Arial" w:cs="Arial"/>
+          <w:szCs w:val="22"/>
+          <w:lang w:bidi="dz-BT"/>
+        </w:rPr>
+      </w:pPr>
+      <w:r>
+        <w:rPr>
+          <w:rFonts w:ascii="Arial" w:eastAsia="Times New Roman" w:hAnsi="Arial" w:cs="Arial"/>
+          <w:szCs w:val="22"/>
+          <w:lang w:bidi="dz-BT"/>
+        </w:rPr>
+        <w:t>First, Karma begins to trust it because it feels stable. When he sees that the payment is backed by gold, it doesn’t feel risky or uncertain. It feels more like something solid and dependable.</w:t>
+      </w:r>
+    </w:p>
+    <w:p>
+      <w:pPr>
+        <w:spacing w:before="100" w:beforeAutospacing="1" w:after="100" w:afterAutospacing="1" w:line="360" w:lineRule="auto"/>
+        <w:jc w:val="both"/>
+        <w:outlineLvl w:val="1"/>
+        <w:rPr>
+          <w:rFonts w:ascii="Arial" w:eastAsia="Times New Roman" w:hAnsi="Arial" w:cs="Arial"/>
+          <w:szCs w:val="22"/>
+          <w:lang w:bidi="dz-BT"/>
+        </w:rPr>
+      </w:pPr>
+      <w:r>
+        <w:rPr>
+          <w:rFonts w:ascii="Arial" w:eastAsia="Times New Roman" w:hAnsi="Arial" w:cs="Arial"/>
+          <w:szCs w:val="22"/>
+          <w:lang w:bidi="dz-BT"/>
+        </w:rPr>
+        <w:t xml:space="preserve">Another important part happens quietly in the background. From one payment, both Karma and </w:t>
       </w:r>
       <w:proofErr w:type="spellStart"/>
       <w:r>
@@ -2108,56 +2100,77 @@
           <w:szCs w:val="22"/>
           <w:lang w:bidi="dz-BT"/>
         </w:rPr>
-        <w:t xml:space="preserve"> uses TER because it helps her, lower fees and automatic savings. It’s not just a nice idea, it actually benefits her business.</w:t>
-      </w:r>
-    </w:p>
-    <w:p>
-      <w:pPr>
-        <w:pStyle w:val="ListParagraph"/>
-        <w:numPr>
-          <w:ilvl w:val="0"/>
-          <w:numId w:val="3"/>
-        </w:numPr>
-        <w:spacing w:before="100" w:beforeAutospacing="1" w:after="100" w:afterAutospacing="1" w:line="360" w:lineRule="auto"/>
-        <w:jc w:val="both"/>
-        <w:rPr>
-          <w:rFonts w:ascii="Arial" w:eastAsia="Times New Roman" w:hAnsi="Arial" w:cs="Arial"/>
-          <w:b/>
-          <w:bCs/>
-          <w:szCs w:val="22"/>
-          <w:lang w:bidi="dz-BT"/>
-        </w:rPr>
-      </w:pPr>
-      <w:r>
-        <w:rPr>
-          <w:rFonts w:ascii="Arial" w:eastAsia="Times New Roman" w:hAnsi="Arial" w:cs="Arial"/>
-          <w:b/>
-          <w:bCs/>
-          <w:szCs w:val="22"/>
-          <w:lang w:bidi="dz-BT"/>
-        </w:rPr>
-        <w:t>Trust spreads through people</w:t>
-      </w:r>
-    </w:p>
-    <w:p>
-      <w:pPr>
-        <w:pStyle w:val="ListParagraph"/>
-        <w:spacing w:before="100" w:beforeAutospacing="1" w:after="100" w:afterAutospacing="1" w:line="360" w:lineRule="auto"/>
-        <w:jc w:val="both"/>
-        <w:rPr>
-          <w:rFonts w:ascii="Times New Roman" w:eastAsia="Times New Roman" w:hAnsi="Times New Roman" w:cs="Times New Roman"/>
-          <w:sz w:val="24"/>
-          <w:szCs w:val="24"/>
-          <w:lang w:bidi="dz-BT"/>
-        </w:rPr>
-      </w:pPr>
-      <w:r>
-        <w:rPr>
-          <w:rFonts w:ascii="Arial" w:eastAsia="Times New Roman" w:hAnsi="Arial" w:cs="Arial"/>
-          <w:szCs w:val="22"/>
-          <w:lang w:bidi="dz-BT"/>
-        </w:rPr>
-        <w:br/>
+        <w:t xml:space="preserve"> save a small amount automatically. They don’t have to think about it or take any extra steps. Over time, this can help both of</w:t>
+      </w:r>
+      <w:r>
+        <w:rPr>
+          <w:rFonts w:ascii="Arial" w:eastAsia="Times New Roman" w:hAnsi="Arial" w:cs="Arial"/>
+          <w:szCs w:val="22"/>
+          <w:lang w:bidi="dz-BT"/>
+        </w:rPr>
+        <w:t xml:space="preserve"> them build savings.</w:t>
+      </w:r>
+      <w:bookmarkStart w:id="0" w:name="_GoBack"/>
+      <w:bookmarkEnd w:id="0"/>
+    </w:p>
+    <w:p>
+      <w:pPr>
+        <w:spacing w:before="100" w:beforeAutospacing="1" w:after="100" w:afterAutospacing="1" w:line="360" w:lineRule="auto"/>
+        <w:jc w:val="both"/>
+        <w:outlineLvl w:val="1"/>
+        <w:rPr>
+          <w:rFonts w:ascii="Arial" w:eastAsia="Times New Roman" w:hAnsi="Arial" w:cs="Arial"/>
+          <w:szCs w:val="22"/>
+          <w:lang w:bidi="dz-BT"/>
+        </w:rPr>
+      </w:pPr>
+      <w:r>
+        <w:rPr>
+          <w:rFonts w:ascii="Arial" w:eastAsia="Times New Roman" w:hAnsi="Arial" w:cs="Arial"/>
+          <w:szCs w:val="22"/>
+          <w:lang w:bidi="dz-BT"/>
+        </w:rPr>
+        <w:t>Karma also feels comfortable using it because only the payment amount is shown. His full balance stays private, which makes the experience feel safer, especially in public places.</w:t>
+      </w:r>
+    </w:p>
+    <w:p>
+      <w:pPr>
+        <w:spacing w:before="100" w:beforeAutospacing="1" w:after="100" w:afterAutospacing="1" w:line="360" w:lineRule="auto"/>
+        <w:jc w:val="both"/>
+        <w:outlineLvl w:val="1"/>
+        <w:rPr>
+          <w:rFonts w:ascii="Arial" w:eastAsia="Times New Roman" w:hAnsi="Arial" w:cs="Arial"/>
+          <w:szCs w:val="22"/>
+          <w:lang w:bidi="dz-BT"/>
+        </w:rPr>
+      </w:pPr>
+      <w:r>
+        <w:rPr>
+          <w:rFonts w:ascii="Arial" w:eastAsia="Times New Roman" w:hAnsi="Arial" w:cs="Arial"/>
+          <w:szCs w:val="22"/>
+          <w:lang w:bidi="dz-BT"/>
+        </w:rPr>
+        <w:t>What really builds his confidence is how smoothly everything works. The payment is fast, clear, and finishes in seconds. That simple experience is enough to remove his doubts.</w:t>
+      </w:r>
+    </w:p>
+    <w:p>
+      <w:pPr>
+        <w:spacing w:before="100" w:beforeAutospacing="1" w:after="100" w:afterAutospacing="1" w:line="360" w:lineRule="auto"/>
+        <w:jc w:val="both"/>
+        <w:outlineLvl w:val="1"/>
+        <w:rPr>
+          <w:rFonts w:ascii="Arial" w:eastAsia="Times New Roman" w:hAnsi="Arial" w:cs="Arial"/>
+          <w:szCs w:val="22"/>
+          <w:lang w:bidi="dz-BT"/>
+        </w:rPr>
+      </w:pPr>
+      <w:r>
+        <w:rPr>
+          <w:rFonts w:ascii="Arial" w:eastAsia="Times New Roman" w:hAnsi="Arial" w:cs="Arial"/>
+          <w:szCs w:val="22"/>
+          <w:lang w:bidi="dz-BT"/>
+        </w:rPr>
+        <w:t xml:space="preserve">For </w:t>
       </w:r>
       <w:proofErr w:type="spellStart"/>
       <w:r>
@@ -2175,27 +2188,46 @@
           <w:szCs w:val="22"/>
           <w:lang w:bidi="dz-BT"/>
         </w:rPr>
-        <w:t xml:space="preserve"> learned from her cousin. Karma will tell his friend. That’s how adoption grows, one person at a time</w:t>
-      </w:r>
-      <w:r>
-        <w:rPr>
-          <w:rFonts w:ascii="Times New Roman" w:eastAsia="Times New Roman" w:hAnsi="Times New Roman" w:cs="Times New Roman"/>
-          <w:sz w:val="24"/>
-          <w:szCs w:val="24"/>
-          <w:lang w:bidi="dz-BT"/>
-        </w:rPr>
-        <w:t>.</w:t>
-      </w:r>
-    </w:p>
-    <w:p>
-      <w:pPr>
-        <w:spacing w:line="360" w:lineRule="auto"/>
-        <w:jc w:val="both"/>
-        <w:rPr>
-          <w:rFonts w:ascii="Arial" w:hAnsi="Arial" w:cs="Arial"/>
-          <w:szCs w:val="22"/>
-        </w:rPr>
-      </w:pPr>
+        <w:t>, TER is not just something new, it is useful. It helps her run her business more smoothly, with lower fees and instant payments. At the same time, a small part of each payment is automatically saved.</w:t>
+      </w:r>
+    </w:p>
+    <w:p>
+      <w:pPr>
+        <w:spacing w:before="100" w:beforeAutospacing="1" w:after="100" w:afterAutospacing="1" w:line="360" w:lineRule="auto"/>
+        <w:jc w:val="both"/>
+        <w:outlineLvl w:val="1"/>
+        <w:rPr>
+          <w:rFonts w:ascii="Arial" w:eastAsia="Times New Roman" w:hAnsi="Arial" w:cs="Arial"/>
+          <w:szCs w:val="22"/>
+          <w:lang w:bidi="dz-BT"/>
+        </w:rPr>
+      </w:pPr>
+      <w:r>
+        <w:rPr>
+          <w:rFonts w:ascii="Arial" w:eastAsia="Times New Roman" w:hAnsi="Arial" w:cs="Arial"/>
+          <w:szCs w:val="22"/>
+          <w:lang w:bidi="dz-BT"/>
+        </w:rPr>
+        <w:t xml:space="preserve">In the end, people trust what they see others using. </w:t>
+      </w:r>
+      <w:proofErr w:type="spellStart"/>
+      <w:r>
+        <w:rPr>
+          <w:rFonts w:ascii="Arial" w:eastAsia="Times New Roman" w:hAnsi="Arial" w:cs="Arial"/>
+          <w:szCs w:val="22"/>
+          <w:lang w:bidi="dz-BT"/>
+        </w:rPr>
+        <w:t>Deki</w:t>
+      </w:r>
+      <w:proofErr w:type="spellEnd"/>
+      <w:r>
+        <w:rPr>
+          <w:rFonts w:ascii="Arial" w:eastAsia="Times New Roman" w:hAnsi="Arial" w:cs="Arial"/>
+          <w:szCs w:val="22"/>
+          <w:lang w:bidi="dz-BT"/>
+        </w:rPr>
+        <w:t xml:space="preserve"> learned from her cousin, and now Karma will share it with his friend. This is how trust grows, one person at a time.</w:t>
+      </w:r>
     </w:p>
     <w:p>
       <w:pPr>
@@ -2270,15 +2302,6 @@
           <w:t>https://analysis-stability-trust-ter.netlify.app/</w:t>
         </w:r>
       </w:hyperlink>
-    </w:p>
-    <w:p>
-      <w:pPr>
-        <w:pStyle w:val="NormalWeb"/>
-        <w:spacing w:line="276" w:lineRule="auto"/>
-        <w:jc w:val="both"/>
-      </w:pPr>
-      <w:bookmarkStart w:id="4" w:name="_GoBack"/>
-      <w:bookmarkEnd w:id="4"/>
     </w:p>
     <w:p/>
     <w:sectPr>
@@ -2291,106 +2314,9 @@
 </w:document>
 </file>
 
-<file path=word/commentsExtensible.xml><?xml version="1.0" encoding="utf-8"?>
-<wetp:commentsExtensible xmlns:wetp="http://schemas.microsoft.com/office/word/2018/wordml/cex"/>
-</file>
-
-<file path=word/commentsIds.xml><?xml version="1.0" encoding="utf-8"?>
-<w16cid:commentsIds xmlns:w16cid="http://schemas.microsoft.com/office/word/2016/wordml/cid"/>
-</file>
-
 <file path=word/numbering.xml><?xml version="1.0" encoding="utf-8"?>
 <w:numbering xmlns:wpc="http://schemas.microsoft.com/office/word/2010/wordprocessingCanvas" xmlns:mc="http://schemas.openxmlformats.org/markup-compatibility/2006" xmlns:o="urn:schemas-microsoft-com:office:office" xmlns:r="http://schemas.openxmlformats.org/officeDocument/2006/relationships" xmlns:m="http://schemas.openxmlformats.org/officeDocument/2006/math" xmlns:v="urn:schemas-microsoft-com:vml" xmlns:wp14="http://schemas.microsoft.com/office/word/2010/wordprocessingDrawing" xmlns:wp="http://schemas.openxmlformats.org/drawingml/2006/wordprocessingDrawing" xmlns:w10="urn:schemas-microsoft-com:office:word" xmlns:w="http://schemas.openxmlformats.org/wordprocessingml/2006/main" xmlns:w14="http://schemas.microsoft.com/office/word/2010/wordml" xmlns:w15="http://schemas.microsoft.com/office/word/2012/wordml" xmlns:wpg="http://schemas.microsoft.com/office/word/2010/wordprocessingGroup" xmlns:wpi="http://schemas.microsoft.com/office/word/2010/wordprocessingInk" xmlns:wne="http://schemas.microsoft.com/office/word/2006/wordml" xmlns:wps="http://schemas.microsoft.com/office/word/2010/wordprocessingShape" mc:Ignorable="w14 w15 wp14">
   <w:abstractNum w:abstractNumId="0">
-    <w:nsid w:val="34834FD0"/>
-    <w:multiLevelType w:val="hybridMultilevel"/>
-    <w:tmpl w:val="2E48055C"/>
-    <w:lvl w:ilvl="0" w:tplc="0409000F">
-      <w:start w:val="1"/>
-      <w:numFmt w:val="decimal"/>
-      <w:lvlText w:val="%1."/>
-      <w:lvlJc w:val="left"/>
-      <w:pPr>
-        <w:ind w:left="720" w:hanging="360"/>
-      </w:pPr>
-      <w:rPr>
-        <w:rFonts w:hint="default"/>
-      </w:rPr>
-    </w:lvl>
-    <w:lvl w:ilvl="1" w:tplc="04090019" w:tentative="1">
-      <w:start w:val="1"/>
-      <w:numFmt w:val="lowerLetter"/>
-      <w:lvlText w:val="%2."/>
-      <w:lvlJc w:val="left"/>
-      <w:pPr>
-        <w:ind w:left="1440" w:hanging="360"/>
-      </w:pPr>
-    </w:lvl>
-    <w:lvl w:ilvl="2" w:tplc="0409001B" w:tentative="1">
-      <w:start w:val="1"/>
-      <w:numFmt w:val="lowerRoman"/>
-      <w:lvlText w:val="%3."/>
-      <w:lvlJc w:val="right"/>
-      <w:pPr>
-        <w:ind w:left="2160" w:hanging="180"/>
-      </w:pPr>
-    </w:lvl>
-    <w:lvl w:ilvl="3" w:tplc="0409000F" w:tentative="1">
-      <w:start w:val="1"/>
-      <w:numFmt w:val="decimal"/>
-      <w:lvlText w:val="%4."/>
-      <w:lvlJc w:val="left"/>
-      <w:pPr>
-        <w:ind w:left="2880" w:hanging="360"/>
-      </w:pPr>
-    </w:lvl>
-    <w:lvl w:ilvl="4" w:tplc="04090019" w:tentative="1">
-      <w:start w:val="1"/>
-      <w:numFmt w:val="lowerLetter"/>
-      <w:lvlText w:val="%5."/>
-      <w:lvlJc w:val="left"/>
-      <w:pPr>
-        <w:ind w:left="3600" w:hanging="360"/>
-      </w:pPr>
-    </w:lvl>
-    <w:lvl w:ilvl="5" w:tplc="0409001B" w:tentative="1">
-      <w:start w:val="1"/>
-      <w:numFmt w:val="lowerRoman"/>
-      <w:lvlText w:val="%6."/>
-      <w:lvlJc w:val="right"/>
-      <w:pPr>
-        <w:ind w:left="4320" w:hanging="180"/>
-      </w:pPr>
-    </w:lvl>
-    <w:lvl w:ilvl="6" w:tplc="0409000F" w:tentative="1">
-      <w:start w:val="1"/>
-      <w:numFmt w:val="decimal"/>
-      <w:lvlText w:val="%7."/>
-      <w:lvlJc w:val="left"/>
-      <w:pPr>
-        <w:ind w:left="5040" w:hanging="360"/>
-      </w:pPr>
-    </w:lvl>
-    <w:lvl w:ilvl="7" w:tplc="04090019" w:tentative="1">
-      <w:start w:val="1"/>
-      <w:numFmt w:val="lowerLetter"/>
-      <w:lvlText w:val="%8."/>
-      <w:lvlJc w:val="left"/>
-      <w:pPr>
-        <w:ind w:left="5760" w:hanging="360"/>
-      </w:pPr>
-    </w:lvl>
-    <w:lvl w:ilvl="8" w:tplc="0409001B" w:tentative="1">
-      <w:start w:val="1"/>
-      <w:numFmt w:val="lowerRoman"/>
-      <w:lvlText w:val="%9."/>
-      <w:lvlJc w:val="right"/>
-      <w:pPr>
-        <w:ind w:left="6480" w:hanging="180"/>
-      </w:pPr>
-    </w:lvl>
-  </w:abstractNum>
-  <w:abstractNum w:abstractNumId="1">
     <w:nsid w:val="7537027F"/>
     <w:multiLevelType w:val="multilevel"/>
     <w:tmpl w:val="D0584EF6"/>
@@ -2539,7 +2465,7 @@
       </w:rPr>
     </w:lvl>
   </w:abstractNum>
-  <w:abstractNum w:abstractNumId="2">
+  <w:abstractNum w:abstractNumId="1">
     <w:nsid w:val="79BD19D2"/>
     <w:multiLevelType w:val="multilevel"/>
     <w:tmpl w:val="6F36FD82"/>
@@ -2689,23 +2615,12 @@
     </w:lvl>
   </w:abstractNum>
   <w:num w:numId="1">
-    <w:abstractNumId w:val="2"/>
+    <w:abstractNumId w:val="1"/>
   </w:num>
   <w:num w:numId="2">
-    <w:abstractNumId w:val="1"/>
-  </w:num>
-  <w:num w:numId="3">
     <w:abstractNumId w:val="0"/>
   </w:num>
 </w:numbering>
-</file>
-
-<file path=word/people.xml><?xml version="1.0" encoding="utf-8"?>
-<w15:people xmlns:wpc="http://schemas.microsoft.com/office/word/2010/wordprocessingCanvas" xmlns:mc="http://schemas.openxmlformats.org/markup-compatibility/2006" xmlns:o="urn:schemas-microsoft-com:office:office" xmlns:r="http://schemas.openxmlformats.org/officeDocument/2006/relationships" xmlns:m="http://schemas.openxmlformats.org/officeDocument/2006/math" xmlns:v="urn:schemas-microsoft-com:vml" xmlns:wp14="http://schemas.microsoft.com/office/word/2010/wordprocessingDrawing" xmlns:wp="http://schemas.openxmlformats.org/drawingml/2006/wordprocessingDrawing" xmlns:w10="urn:schemas-microsoft-com:office:word" xmlns:w="http://schemas.openxmlformats.org/wordprocessingml/2006/main" xmlns:w14="http://schemas.microsoft.com/office/word/2010/wordml" xmlns:w15="http://schemas.microsoft.com/office/word/2012/wordml" xmlns:wpg="http://schemas.microsoft.com/office/word/2010/wordprocessingGroup" xmlns:wpi="http://schemas.microsoft.com/office/word/2010/wordprocessingInk" xmlns:wne="http://schemas.microsoft.com/office/word/2006/wordml" xmlns:wps="http://schemas.microsoft.com/office/word/2010/wordprocessingShape" mc:Ignorable="w14 w15 wp14">
-  <w15:person w15:author="Microsoft account">
-    <w15:presenceInfo w15:providerId="Windows Live" w15:userId="4ff5af364bceca0f"/>
-  </w15:person>
-</w15:people>
 </file>
 
 <file path=word/styles.xml><?xml version="1.0" encoding="utf-8"?>
@@ -3101,7 +3016,7 @@
   <w:style w:type="paragraph" w:default="1" w:styleId="Normal">
     <w:name w:val="Normal"/>
     <w:qFormat/>
-    <w:rsid w:val="009C7BA1"/>
+    <w:rsid w:val="00036477"/>
   </w:style>
   <w:style w:type="paragraph" w:styleId="Heading2">
     <w:name w:val="heading 2"/>
@@ -3109,7 +3024,7 @@
     <w:link w:val="Heading2Char"/>
     <w:uiPriority w:val="9"/>
     <w:qFormat/>
-    <w:rsid w:val="001E2E1E"/>
+    <w:rsid w:val="00081B5D"/>
     <w:pPr>
       <w:spacing w:before="100" w:beforeAutospacing="1" w:after="100" w:afterAutospacing="1" w:line="240" w:lineRule="auto"/>
       <w:outlineLvl w:val="1"/>
@@ -3150,110 +3065,12 @@
     <w:semiHidden/>
     <w:unhideWhenUsed/>
   </w:style>
-  <w:style w:type="character" w:styleId="CommentReference">
-    <w:name w:val="annotation reference"/>
-    <w:basedOn w:val="DefaultParagraphFont"/>
-    <w:uiPriority w:val="99"/>
-    <w:semiHidden/>
-    <w:unhideWhenUsed/>
-    <w:rsid w:val="009C7BA1"/>
-    <w:rPr>
-      <w:sz w:val="16"/>
-      <w:szCs w:val="16"/>
-    </w:rPr>
-  </w:style>
-  <w:style w:type="paragraph" w:styleId="BalloonText">
-    <w:name w:val="Balloon Text"/>
-    <w:basedOn w:val="Normal"/>
-    <w:link w:val="BalloonTextChar"/>
-    <w:uiPriority w:val="99"/>
-    <w:semiHidden/>
-    <w:unhideWhenUsed/>
-    <w:rsid w:val="009C7BA1"/>
-    <w:pPr>
-      <w:spacing w:after="0" w:line="240" w:lineRule="auto"/>
-    </w:pPr>
-    <w:rPr>
-      <w:rFonts w:ascii="Segoe UI" w:hAnsi="Segoe UI" w:cs="Segoe UI"/>
-      <w:sz w:val="18"/>
-      <w:szCs w:val="26"/>
-    </w:rPr>
-  </w:style>
-  <w:style w:type="character" w:customStyle="1" w:styleId="BalloonTextChar">
-    <w:name w:val="Balloon Text Char"/>
-    <w:basedOn w:val="DefaultParagraphFont"/>
-    <w:link w:val="BalloonText"/>
-    <w:uiPriority w:val="99"/>
-    <w:semiHidden/>
-    <w:rsid w:val="009C7BA1"/>
-    <w:rPr>
-      <w:rFonts w:ascii="Segoe UI" w:hAnsi="Segoe UI" w:cs="Segoe UI"/>
-      <w:sz w:val="18"/>
-      <w:szCs w:val="26"/>
-    </w:rPr>
-  </w:style>
-  <w:style w:type="paragraph" w:styleId="CommentText">
-    <w:name w:val="annotation text"/>
-    <w:basedOn w:val="Normal"/>
-    <w:link w:val="CommentTextChar"/>
-    <w:uiPriority w:val="99"/>
-    <w:semiHidden/>
-    <w:unhideWhenUsed/>
-    <w:rsid w:val="009C7BA1"/>
-    <w:pPr>
-      <w:spacing w:line="240" w:lineRule="auto"/>
-    </w:pPr>
-    <w:rPr>
-      <w:sz w:val="20"/>
-      <w:szCs w:val="29"/>
-    </w:rPr>
-  </w:style>
-  <w:style w:type="character" w:customStyle="1" w:styleId="CommentTextChar">
-    <w:name w:val="Comment Text Char"/>
-    <w:basedOn w:val="DefaultParagraphFont"/>
-    <w:link w:val="CommentText"/>
-    <w:uiPriority w:val="99"/>
-    <w:semiHidden/>
-    <w:rsid w:val="009C7BA1"/>
-    <w:rPr>
-      <w:sz w:val="20"/>
-      <w:szCs w:val="29"/>
-    </w:rPr>
-  </w:style>
-  <w:style w:type="paragraph" w:styleId="CommentSubject">
-    <w:name w:val="annotation subject"/>
-    <w:basedOn w:val="CommentText"/>
-    <w:next w:val="CommentText"/>
-    <w:link w:val="CommentSubjectChar"/>
-    <w:uiPriority w:val="99"/>
-    <w:semiHidden/>
-    <w:unhideWhenUsed/>
-    <w:rsid w:val="009C7BA1"/>
-    <w:rPr>
-      <w:b/>
-      <w:bCs/>
-    </w:rPr>
-  </w:style>
-  <w:style w:type="character" w:customStyle="1" w:styleId="CommentSubjectChar">
-    <w:name w:val="Comment Subject Char"/>
-    <w:basedOn w:val="CommentTextChar"/>
-    <w:link w:val="CommentSubject"/>
-    <w:uiPriority w:val="99"/>
-    <w:semiHidden/>
-    <w:rsid w:val="009C7BA1"/>
-    <w:rPr>
-      <w:b/>
-      <w:bCs/>
-      <w:sz w:val="20"/>
-      <w:szCs w:val="29"/>
-    </w:rPr>
-  </w:style>
   <w:style w:type="character" w:customStyle="1" w:styleId="Heading2Char">
     <w:name w:val="Heading 2 Char"/>
     <w:basedOn w:val="DefaultParagraphFont"/>
     <w:link w:val="Heading2"/>
     <w:uiPriority w:val="9"/>
-    <w:rsid w:val="001E2E1E"/>
+    <w:rsid w:val="00081B5D"/>
     <w:rPr>
       <w:rFonts w:ascii="Times New Roman" w:eastAsia="Times New Roman" w:hAnsi="Times New Roman" w:cs="Times New Roman"/>
       <w:b/>
@@ -3269,7 +3086,7 @@
     <w:uiPriority w:val="99"/>
     <w:semiHidden/>
     <w:unhideWhenUsed/>
-    <w:rsid w:val="001E2E1E"/>
+    <w:rsid w:val="00081B5D"/>
     <w:pPr>
       <w:spacing w:before="100" w:beforeAutospacing="1" w:after="100" w:afterAutospacing="1" w:line="240" w:lineRule="auto"/>
     </w:pPr>
@@ -3280,48 +3097,16 @@
       <w:lang w:bidi="dz-BT"/>
     </w:rPr>
   </w:style>
-  <w:style w:type="character" w:styleId="Strong">
-    <w:name w:val="Strong"/>
-    <w:basedOn w:val="DefaultParagraphFont"/>
-    <w:uiPriority w:val="22"/>
-    <w:qFormat/>
-    <w:rsid w:val="001E2E1E"/>
-    <w:rPr>
-      <w:b/>
-      <w:bCs/>
-    </w:rPr>
-  </w:style>
-  <w:style w:type="paragraph" w:styleId="ListParagraph">
-    <w:name w:val="List Paragraph"/>
-    <w:basedOn w:val="Normal"/>
-    <w:uiPriority w:val="34"/>
-    <w:qFormat/>
-    <w:rsid w:val="001E2E1E"/>
-    <w:pPr>
-      <w:ind w:left="720"/>
-      <w:contextualSpacing/>
-    </w:pPr>
-  </w:style>
   <w:style w:type="character" w:styleId="Hyperlink">
     <w:name w:val="Hyperlink"/>
     <w:basedOn w:val="DefaultParagraphFont"/>
     <w:uiPriority w:val="99"/>
     <w:unhideWhenUsed/>
-    <w:rsid w:val="00B56D7E"/>
+    <w:rsid w:val="00081B5D"/>
     <w:rPr>
       <w:color w:val="0563C1" w:themeColor="hyperlink"/>
       <w:u w:val="single"/>
     </w:rPr>
-  </w:style>
-  <w:style w:type="paragraph" w:styleId="Revision">
-    <w:name w:val="Revision"/>
-    <w:hidden/>
-    <w:uiPriority w:val="99"/>
-    <w:semiHidden/>
-    <w:rsid w:val="00FD1D4D"/>
-    <w:pPr>
-      <w:spacing w:after="0" w:line="240" w:lineRule="auto"/>
-    </w:pPr>
   </w:style>
 </w:styles>
 </file>

</xml_diff>